<commit_message>
Remove report appendix and use black methodology labels
</commit_message>
<xml_diff>
--- a/deliverables/Report.docx
+++ b/deliverables/Report.docx
@@ -1526,75 +1526,9 @@
           <w:color w:val="000000"/>
           <w:sz w:val="24"/>
         </w:rPr>
-        <w:t>APPENDIX A REPRODUCTION AND EVIDENCE FILES</w:t>
+        <w:t>REFERENCES</w:t>
         <w:tab/>
         <w:t>26</w:t>
-      </w:r>
-    </w:p>
-    <w:p>
-      <w:pPr>
-        <w:tabs>
-          <w:tab w:pos="9026" w:val="right" w:leader="dot"/>
-        </w:tabs>
-        <w:spacing w:before="0" w:after="140" w:line="340" w:lineRule="exact"/>
-        <w:ind w:firstLine="0" w:left="360" w:right="0"/>
-        <w:jc w:val="left"/>
-      </w:pPr>
-      <w:r>
-        <w:rPr>
-          <w:rFonts w:ascii="Times New Roman" w:hAnsi="Times New Roman" w:eastAsia="Times New Roman" w:cs="Times New Roman"/>
-          <w:b w:val="0"/>
-          <w:i w:val="0"/>
-          <w:color w:val="000000"/>
-          <w:sz w:val="24"/>
-        </w:rPr>
-        <w:t>A.1 Reproduction commands</w:t>
-        <w:tab/>
-        <w:t>26</w:t>
-      </w:r>
-    </w:p>
-    <w:p>
-      <w:pPr>
-        <w:tabs>
-          <w:tab w:pos="9026" w:val="right" w:leader="dot"/>
-        </w:tabs>
-        <w:spacing w:before="0" w:after="140" w:line="340" w:lineRule="exact"/>
-        <w:ind w:firstLine="0" w:left="360" w:right="0"/>
-        <w:jc w:val="left"/>
-      </w:pPr>
-      <w:r>
-        <w:rPr>
-          <w:rFonts w:ascii="Times New Roman" w:hAnsi="Times New Roman" w:eastAsia="Times New Roman" w:cs="Times New Roman"/>
-          <w:b w:val="0"/>
-          <w:i w:val="0"/>
-          <w:color w:val="000000"/>
-          <w:sz w:val="24"/>
-        </w:rPr>
-        <w:t>A.2 Evidence files</w:t>
-        <w:tab/>
-        <w:t>26</w:t>
-      </w:r>
-    </w:p>
-    <w:p>
-      <w:pPr>
-        <w:tabs>
-          <w:tab w:pos="9026" w:val="right"/>
-        </w:tabs>
-        <w:spacing w:line="340" w:lineRule="exact" w:after="140" w:before="0"/>
-        <w:ind w:left="0" w:firstLine="0" w:right="0"/>
-        <w:jc w:val="left"/>
-      </w:pPr>
-      <w:r>
-        <w:rPr>
-          <w:rFonts w:ascii="Times New Roman" w:hAnsi="Times New Roman" w:eastAsia="Times New Roman" w:cs="Times New Roman"/>
-          <w:b/>
-          <w:i w:val="0"/>
-          <w:color w:val="000000"/>
-          <w:sz w:val="24"/>
-        </w:rPr>
-        <w:t>REFERENCES</w:t>
-        <w:tab/>
-        <w:t>28</w:t>
       </w:r>
     </w:p>
     <w:p>
@@ -1878,28 +1812,6 @@
         <w:t>5.2  Fibre fraction region test results</w:t>
         <w:tab/>
         <w:t>21</w:t>
-      </w:r>
-    </w:p>
-    <w:p>
-      <w:pPr>
-        <w:tabs>
-          <w:tab w:pos="9026" w:val="right" w:leader="dot"/>
-        </w:tabs>
-        <w:spacing w:line="340" w:lineRule="exact" w:after="140" w:before="0"/>
-        <w:ind w:left="360" w:firstLine="0" w:right="0"/>
-        <w:jc w:val="left"/>
-      </w:pPr>
-      <w:r>
-        <w:rPr>
-          <w:rFonts w:ascii="Times New Roman" w:hAnsi="Times New Roman" w:eastAsia="Times New Roman" w:cs="Times New Roman"/>
-          <w:b w:val="0"/>
-          <w:i w:val="0"/>
-          <w:color w:val="000000"/>
-          <w:sz w:val="24"/>
-        </w:rPr>
-        <w:t>A.1  Reproduction evidence files</w:t>
-        <w:tab/>
-        <w:t>26</w:t>
       </w:r>
     </w:p>
     <w:p>
@@ -14141,862 +14053,6 @@
           <w:color w:val="000000"/>
           <w:sz w:val="34"/>
         </w:rPr>
-        <w:t>APPENDIX A REPRODUCTION AND EVIDENCE FILES</w:t>
-      </w:r>
-    </w:p>
-    <w:p>
-      <w:pPr>
-        <w:spacing w:before="0" w:after="200" w:line="433" w:lineRule="exact"/>
-        <w:ind w:firstLine="0" w:left="0" w:right="0"/>
-        <w:jc w:val="both"/>
-      </w:pPr>
-      <w:r>
-        <w:rPr>
-          <w:rFonts w:ascii="Times New Roman" w:hAnsi="Times New Roman" w:eastAsia="Times New Roman" w:cs="Times New Roman"/>
-          <w:b w:val="0"/>
-          <w:i w:val="0"/>
-          <w:color w:val="000000"/>
-          <w:sz w:val="24"/>
-        </w:rPr>
-        <w:t>The demonstration runs locally in Streamlit. START_DEMO.bat launches the nine-tab browser dashboard for prediction, scenario comparison, sensitivity, six-property direct simulator experiments, dataset inspection, training and literature review. The saved forest uses three input features. Changing direct simulator material controls does not retrain or extend that forest.</w:t>
-      </w:r>
-    </w:p>
-    <w:p>
-      <w:pPr>
-        <w:pStyle w:val="Heading2"/>
-        <w:keepNext/>
-        <w:spacing w:before="360" w:after="440" w:line="440" w:lineRule="exact"/>
-        <w:ind w:firstLine="0" w:left="0" w:right="0"/>
-        <w:jc w:val="left"/>
-      </w:pPr>
-      <w:r>
-        <w:rPr>
-          <w:rFonts w:ascii="Times New Roman" w:hAnsi="Times New Roman" w:eastAsia="Times New Roman" w:cs="Times New Roman"/>
-          <w:b/>
-          <w:i w:val="0"/>
-          <w:color w:val="000000"/>
-          <w:sz w:val="34"/>
-        </w:rPr>
-        <w:t>A.1 Reproduction commands</w:t>
-      </w:r>
-    </w:p>
-    <w:p>
-      <w:pPr>
-        <w:spacing w:line="433" w:lineRule="exact" w:after="160" w:before="0"/>
-        <w:ind w:firstLine="0" w:left="0" w:right="0"/>
-        <w:jc w:val="both"/>
-      </w:pPr>
-      <w:r>
-        <w:rPr>
-          <w:rFonts w:ascii="Times New Roman" w:hAnsi="Times New Roman" w:eastAsia="Times New Roman" w:cs="Times New Roman"/>
-          <w:b w:val="0"/>
-          <w:i w:val="0"/>
-          <w:color w:val="000000"/>
-          <w:sz w:val="24"/>
-        </w:rPr>
-        <w:t>Run these commands from the extracted project folder with Python 3.11 installed. The explicit virtual environment executable avoids changing PowerShell activation policy. Retraining locally is recommended because saved scikit learn models depend on library versions.</w:t>
-      </w:r>
-    </w:p>
-    <w:p>
-      <w:pPr>
-        <w:spacing w:line="240" w:lineRule="auto" w:after="60"/>
-        <w:jc w:val="both"/>
-      </w:pPr>
-      <w:r>
-        <w:rPr>
-          <w:rFonts w:ascii="Consolas" w:hAnsi="Consolas"/>
-          <w:sz w:val="19"/>
-        </w:rPr>
-        <w:t>py -3.11 -m venv .venv</w:t>
-      </w:r>
-    </w:p>
-    <w:p>
-      <w:pPr>
-        <w:spacing w:line="240" w:lineRule="auto" w:after="60"/>
-        <w:jc w:val="both"/>
-      </w:pPr>
-      <w:r>
-        <w:rPr>
-          <w:rFonts w:ascii="Consolas" w:hAnsi="Consolas"/>
-          <w:sz w:val="19"/>
-        </w:rPr>
-        <w:t>.\.venv\Scripts\python.exe -m pip install -r requirements.txt</w:t>
-      </w:r>
-    </w:p>
-    <w:p>
-      <w:pPr>
-        <w:spacing w:line="240" w:lineRule="auto" w:after="60"/>
-        <w:jc w:val="both"/>
-      </w:pPr>
-      <w:r>
-        <w:rPr>
-          <w:rFonts w:ascii="Consolas" w:hAnsi="Consolas"/>
-          <w:sz w:val="19"/>
-        </w:rPr>
-        <w:t>.\.venv\Scripts\python.exe -m src.simulate_data</w:t>
-      </w:r>
-    </w:p>
-    <w:p>
-      <w:pPr>
-        <w:spacing w:line="240" w:lineRule="auto" w:after="60"/>
-        <w:jc w:val="both"/>
-      </w:pPr>
-      <w:r>
-        <w:rPr>
-          <w:rFonts w:ascii="Consolas" w:hAnsi="Consolas"/>
-          <w:sz w:val="19"/>
-        </w:rPr>
-        <w:t>.\.venv\Scripts\python.exe -m src.train</w:t>
-      </w:r>
-    </w:p>
-    <w:p>
-      <w:pPr>
-        <w:spacing w:line="240" w:lineRule="auto" w:after="60"/>
-        <w:jc w:val="both"/>
-      </w:pPr>
-      <w:r>
-        <w:rPr>
-          <w:rFonts w:ascii="Consolas" w:hAnsi="Consolas"/>
-          <w:sz w:val="19"/>
-        </w:rPr>
-        <w:t>.\.venv\Scripts\python.exe -m pytest -q</w:t>
-      </w:r>
-    </w:p>
-    <w:p>
-      <w:pPr>
-        <w:spacing w:line="240" w:lineRule="auto" w:after="60"/>
-        <w:jc w:val="both"/>
-      </w:pPr>
-      <w:r>
-        <w:rPr>
-          <w:rFonts w:ascii="Consolas" w:hAnsi="Consolas"/>
-          <w:sz w:val="19"/>
-        </w:rPr>
-        <w:t>.\.venv\Scripts\python.exe -m streamlit run app.py</w:t>
-      </w:r>
-    </w:p>
-    <w:p>
-      <w:pPr>
-        <w:pStyle w:val="Heading2"/>
-        <w:keepNext/>
-        <w:spacing w:before="560" w:after="440" w:line="440" w:lineRule="exact"/>
-        <w:ind w:firstLine="0" w:left="0" w:right="0"/>
-        <w:jc w:val="left"/>
-      </w:pPr>
-      <w:r>
-        <w:rPr>
-          <w:rFonts w:ascii="Times New Roman" w:hAnsi="Times New Roman" w:eastAsia="Times New Roman" w:cs="Times New Roman"/>
-          <w:b/>
-          <w:i w:val="0"/>
-          <w:color w:val="000000"/>
-          <w:sz w:val="34"/>
-        </w:rPr>
-        <w:t>A.2 Evidence files</w:t>
-      </w:r>
-    </w:p>
-    <w:p>
-      <w:pPr>
-        <w:keepNext/>
-        <w:spacing w:after="160" w:line="288" w:lineRule="exact" w:before="200"/>
-        <w:ind w:firstLine="0" w:left="0" w:right="0"/>
-        <w:jc w:val="center"/>
-      </w:pPr>
-      <w:r>
-        <w:rPr>
-          <w:rFonts w:ascii="Times New Roman" w:hAnsi="Times New Roman" w:eastAsia="Times New Roman" w:cs="Times New Roman"/>
-          <w:b w:val="0"/>
-          <w:i w:val="0"/>
-          <w:color w:val="000000"/>
-          <w:sz w:val="24"/>
-        </w:rPr>
-        <w:t>Table A.1: Reproduction evidence files</w:t>
-      </w:r>
-    </w:p>
-    <w:tbl>
-      <w:tblPr>
-        <w:tblW w:type="auto" w:w="0"/>
-        <w:jc w:val="center"/>
-        <w:tblLayout w:type="fixed"/>
-        <w:tblLook w:firstColumn="1" w:firstRow="1" w:lastColumn="0" w:lastRow="0" w:noHBand="0" w:noVBand="1" w:val="04A0"/>
-        <w:tblBorders>
-          <w:top w:val="single" w:sz="4" w:color="000000"/>
-          <w:left w:val="single" w:sz="4" w:color="000000"/>
-          <w:bottom w:val="single" w:sz="4" w:color="000000"/>
-          <w:right w:val="single" w:sz="4" w:color="000000"/>
-          <w:insideH w:val="single" w:sz="4" w:color="000000"/>
-          <w:insideV w:val="single" w:sz="4" w:color="000000"/>
-        </w:tblBorders>
-      </w:tblPr>
-      <w:tblGrid>
-        <w:gridCol w:w="4247"/>
-        <w:gridCol w:w="4778"/>
-      </w:tblGrid>
-      <w:tr>
-        <w:trPr>
-          <w:cantSplit/>
-          <w:tblHeader/>
-        </w:trPr>
-        <w:tc>
-          <w:tcPr>
-            <w:tcW w:type="dxa" w:w="4247"/>
-            <w:vAlign w:val="center"/>
-            <w:tcBorders>
-              <w:top w:val="single" w:sz="4" w:color="000000"/>
-              <w:left w:val="single" w:sz="4" w:color="000000"/>
-              <w:bottom w:val="single" w:sz="4" w:color="000000"/>
-              <w:right w:val="single" w:sz="4" w:color="000000"/>
-            </w:tcBorders>
-            <w:shd w:fill="FFFFFF"/>
-            <w:tcMar>
-              <w:top w:w="85" w:type="dxa"/>
-              <w:left w:w="85" w:type="dxa"/>
-              <w:bottom w:w="85" w:type="dxa"/>
-              <w:right w:w="85" w:type="dxa"/>
-            </w:tcMar>
-          </w:tcPr>
-          <w:p>
-            <w:pPr>
-              <w:spacing w:after="80" w:before="80" w:line="288" w:lineRule="exact"/>
-              <w:ind w:firstLine="0" w:left="0" w:right="0"/>
-              <w:jc w:val="left"/>
-            </w:pPr>
-            <w:r>
-              <w:rPr>
-                <w:rFonts w:ascii="Times New Roman" w:hAnsi="Times New Roman" w:eastAsia="Times New Roman" w:cs="Times New Roman"/>
-                <w:b/>
-                <w:i w:val="0"/>
-                <w:color w:val="000000"/>
-                <w:sz w:val="24"/>
-              </w:rPr>
-              <w:t>File</w:t>
-            </w:r>
-          </w:p>
-        </w:tc>
-        <w:tc>
-          <w:tcPr>
-            <w:tcW w:type="dxa" w:w="4778"/>
-            <w:vAlign w:val="center"/>
-            <w:tcBorders>
-              <w:top w:val="single" w:sz="4" w:color="000000"/>
-              <w:left w:val="single" w:sz="4" w:color="000000"/>
-              <w:bottom w:val="single" w:sz="4" w:color="000000"/>
-              <w:right w:val="single" w:sz="4" w:color="000000"/>
-            </w:tcBorders>
-            <w:shd w:fill="FFFFFF"/>
-            <w:tcMar>
-              <w:top w:w="85" w:type="dxa"/>
-              <w:left w:w="85" w:type="dxa"/>
-              <w:bottom w:w="85" w:type="dxa"/>
-              <w:right w:w="85" w:type="dxa"/>
-            </w:tcMar>
-          </w:tcPr>
-          <w:p>
-            <w:pPr>
-              <w:spacing w:after="80" w:before="80" w:line="288" w:lineRule="exact"/>
-              <w:ind w:firstLine="0" w:left="0" w:right="0"/>
-              <w:jc w:val="left"/>
-            </w:pPr>
-            <w:r>
-              <w:rPr>
-                <w:rFonts w:ascii="Times New Roman" w:hAnsi="Times New Roman" w:eastAsia="Times New Roman" w:cs="Times New Roman"/>
-                <w:b/>
-                <w:i w:val="0"/>
-                <w:color w:val="000000"/>
-                <w:sz w:val="24"/>
-              </w:rPr>
-              <w:t>Purpose</w:t>
-            </w:r>
-          </w:p>
-        </w:tc>
-      </w:tr>
-      <w:tr>
-        <w:trPr>
-          <w:cantSplit/>
-        </w:trPr>
-        <w:tc>
-          <w:tcPr>
-            <w:tcW w:type="dxa" w:w="4247"/>
-            <w:vAlign w:val="center"/>
-            <w:tcBorders>
-              <w:top w:val="single" w:sz="4" w:color="000000"/>
-              <w:left w:val="single" w:sz="4" w:color="000000"/>
-              <w:bottom w:val="single" w:sz="4" w:color="000000"/>
-              <w:right w:val="single" w:sz="4" w:color="000000"/>
-            </w:tcBorders>
-            <w:shd w:fill="FFFFFF"/>
-            <w:tcMar>
-              <w:top w:w="85" w:type="dxa"/>
-              <w:left w:w="85" w:type="dxa"/>
-              <w:bottom w:w="85" w:type="dxa"/>
-              <w:right w:w="85" w:type="dxa"/>
-            </w:tcMar>
-          </w:tcPr>
-          <w:p>
-            <w:pPr>
-              <w:spacing w:after="80" w:before="80" w:line="288" w:lineRule="exact"/>
-              <w:ind w:firstLine="0" w:left="0" w:right="0"/>
-              <w:jc w:val="left"/>
-            </w:pPr>
-            <w:r>
-              <w:rPr>
-                <w:rFonts w:ascii="Times New Roman" w:hAnsi="Times New Roman" w:eastAsia="Times New Roman" w:cs="Times New Roman"/>
-                <w:b w:val="0"/>
-                <w:i w:val="0"/>
-                <w:color w:val="000000"/>
-                <w:sz w:val="24"/>
-              </w:rPr>
-              <w:t>config/physics_params.json</w:t>
-            </w:r>
-          </w:p>
-        </w:tc>
-        <w:tc>
-          <w:tcPr>
-            <w:tcW w:type="dxa" w:w="4778"/>
-            <w:vAlign w:val="center"/>
-            <w:tcBorders>
-              <w:top w:val="single" w:sz="4" w:color="000000"/>
-              <w:left w:val="single" w:sz="4" w:color="000000"/>
-              <w:bottom w:val="single" w:sz="4" w:color="000000"/>
-              <w:right w:val="single" w:sz="4" w:color="000000"/>
-            </w:tcBorders>
-            <w:shd w:fill="FFFFFF"/>
-            <w:tcMar>
-              <w:top w:w="85" w:type="dxa"/>
-              <w:left w:w="85" w:type="dxa"/>
-              <w:bottom w:w="85" w:type="dxa"/>
-              <w:right w:w="85" w:type="dxa"/>
-            </w:tcMar>
-          </w:tcPr>
-          <w:p>
-            <w:pPr>
-              <w:spacing w:after="80" w:before="80" w:line="288" w:lineRule="exact"/>
-              <w:ind w:firstLine="0" w:left="0" w:right="0"/>
-              <w:jc w:val="left"/>
-            </w:pPr>
-            <w:r>
-              <w:rPr>
-                <w:rFonts w:ascii="Times New Roman" w:hAnsi="Times New Roman" w:eastAsia="Times New Roman" w:cs="Times New Roman"/>
-                <w:b w:val="0"/>
-                <w:i w:val="0"/>
-                <w:color w:val="000000"/>
-                <w:sz w:val="24"/>
-              </w:rPr>
-              <w:t>Nominal assumptions and generation domain</w:t>
-            </w:r>
-          </w:p>
-        </w:tc>
-      </w:tr>
-      <w:tr>
-        <w:trPr>
-          <w:cantSplit/>
-        </w:trPr>
-        <w:tc>
-          <w:tcPr>
-            <w:tcW w:type="dxa" w:w="4247"/>
-            <w:vAlign w:val="center"/>
-            <w:tcBorders>
-              <w:top w:val="single" w:sz="4" w:color="000000"/>
-              <w:left w:val="single" w:sz="4" w:color="000000"/>
-              <w:bottom w:val="single" w:sz="4" w:color="000000"/>
-              <w:right w:val="single" w:sz="4" w:color="000000"/>
-            </w:tcBorders>
-            <w:shd w:fill="FFFFFF"/>
-            <w:tcMar>
-              <w:top w:w="85" w:type="dxa"/>
-              <w:left w:w="85" w:type="dxa"/>
-              <w:bottom w:w="85" w:type="dxa"/>
-              <w:right w:w="85" w:type="dxa"/>
-            </w:tcMar>
-          </w:tcPr>
-          <w:p>
-            <w:pPr>
-              <w:spacing w:after="80" w:before="80" w:line="288" w:lineRule="exact"/>
-              <w:ind w:firstLine="0" w:left="0" w:right="0"/>
-              <w:jc w:val="left"/>
-            </w:pPr>
-            <w:r>
-              <w:rPr>
-                <w:rFonts w:ascii="Times New Roman" w:hAnsi="Times New Roman" w:eastAsia="Times New Roman" w:cs="Times New Roman"/>
-                <w:b w:val="0"/>
-                <w:i w:val="0"/>
-                <w:color w:val="000000"/>
-                <w:sz w:val="24"/>
-              </w:rPr>
-              <w:t>models/metadata.json</w:t>
-            </w:r>
-          </w:p>
-        </w:tc>
-        <w:tc>
-          <w:tcPr>
-            <w:tcW w:type="dxa" w:w="4778"/>
-            <w:vAlign w:val="center"/>
-            <w:tcBorders>
-              <w:top w:val="single" w:sz="4" w:color="000000"/>
-              <w:left w:val="single" w:sz="4" w:color="000000"/>
-              <w:bottom w:val="single" w:sz="4" w:color="000000"/>
-              <w:right w:val="single" w:sz="4" w:color="000000"/>
-            </w:tcBorders>
-            <w:shd w:fill="FFFFFF"/>
-            <w:tcMar>
-              <w:top w:w="85" w:type="dxa"/>
-              <w:left w:w="85" w:type="dxa"/>
-              <w:bottom w:w="85" w:type="dxa"/>
-              <w:right w:w="85" w:type="dxa"/>
-            </w:tcMar>
-          </w:tcPr>
-          <w:p>
-            <w:pPr>
-              <w:spacing w:after="80" w:before="80" w:line="288" w:lineRule="exact"/>
-              <w:ind w:firstLine="0" w:left="0" w:right="0"/>
-              <w:jc w:val="left"/>
-            </w:pPr>
-            <w:r>
-              <w:rPr>
-                <w:rFonts w:ascii="Times New Roman" w:hAnsi="Times New Roman" w:eastAsia="Times New Roman" w:cs="Times New Roman"/>
-                <w:b w:val="0"/>
-                <w:i w:val="0"/>
-                <w:color w:val="000000"/>
-                <w:sz w:val="24"/>
-              </w:rPr>
-              <w:t>Recorded evaluated model, splits and metrics</w:t>
-            </w:r>
-          </w:p>
-        </w:tc>
-      </w:tr>
-      <w:tr>
-        <w:trPr>
-          <w:cantSplit/>
-        </w:trPr>
-        <w:tc>
-          <w:tcPr>
-            <w:tcW w:type="dxa" w:w="4247"/>
-            <w:vAlign w:val="center"/>
-            <w:tcBorders>
-              <w:top w:val="single" w:sz="4" w:color="000000"/>
-              <w:left w:val="single" w:sz="4" w:color="000000"/>
-              <w:bottom w:val="single" w:sz="4" w:color="000000"/>
-              <w:right w:val="single" w:sz="4" w:color="000000"/>
-            </w:tcBorders>
-            <w:shd w:fill="FFFFFF"/>
-            <w:tcMar>
-              <w:top w:w="85" w:type="dxa"/>
-              <w:left w:w="85" w:type="dxa"/>
-              <w:bottom w:w="85" w:type="dxa"/>
-              <w:right w:w="85" w:type="dxa"/>
-            </w:tcMar>
-          </w:tcPr>
-          <w:p>
-            <w:pPr>
-              <w:spacing w:after="80" w:before="80" w:line="288" w:lineRule="exact"/>
-              <w:ind w:firstLine="0" w:left="0" w:right="0"/>
-              <w:jc w:val="left"/>
-            </w:pPr>
-            <w:r>
-              <w:rPr>
-                <w:rFonts w:ascii="Times New Roman" w:hAnsi="Times New Roman" w:eastAsia="Times New Roman" w:cs="Times New Roman"/>
-                <w:b w:val="0"/>
-                <w:i w:val="0"/>
-                <w:color w:val="000000"/>
-                <w:sz w:val="24"/>
-              </w:rPr>
-              <w:t>data/literature/literature_rows.csv</w:t>
-            </w:r>
-          </w:p>
-        </w:tc>
-        <w:tc>
-          <w:tcPr>
-            <w:tcW w:type="dxa" w:w="4778"/>
-            <w:vAlign w:val="center"/>
-            <w:tcBorders>
-              <w:top w:val="single" w:sz="4" w:color="000000"/>
-              <w:left w:val="single" w:sz="4" w:color="000000"/>
-              <w:bottom w:val="single" w:sz="4" w:color="000000"/>
-              <w:right w:val="single" w:sz="4" w:color="000000"/>
-            </w:tcBorders>
-            <w:shd w:fill="FFFFFF"/>
-            <w:tcMar>
-              <w:top w:w="85" w:type="dxa"/>
-              <w:left w:w="85" w:type="dxa"/>
-              <w:bottom w:w="85" w:type="dxa"/>
-              <w:right w:w="85" w:type="dxa"/>
-            </w:tcMar>
-          </w:tcPr>
-          <w:p>
-            <w:pPr>
-              <w:spacing w:after="80" w:before="80" w:line="288" w:lineRule="exact"/>
-              <w:ind w:firstLine="0" w:left="0" w:right="0"/>
-              <w:jc w:val="left"/>
-            </w:pPr>
-            <w:r>
-              <w:rPr>
-                <w:rFonts w:ascii="Times New Roman" w:hAnsi="Times New Roman" w:eastAsia="Times New Roman" w:cs="Times New Roman"/>
-                <w:b w:val="0"/>
-                <w:i w:val="0"/>
-                <w:color w:val="000000"/>
-                <w:sz w:val="24"/>
-              </w:rPr>
-              <w:t>Eight unreviewed extracted mean strength rows</w:t>
-            </w:r>
-          </w:p>
-        </w:tc>
-      </w:tr>
-      <w:tr>
-        <w:trPr>
-          <w:cantSplit/>
-        </w:trPr>
-        <w:tc>
-          <w:tcPr>
-            <w:tcW w:type="dxa" w:w="4247"/>
-            <w:vAlign w:val="center"/>
-            <w:tcBorders>
-              <w:top w:val="single" w:sz="4" w:color="000000"/>
-              <w:left w:val="single" w:sz="4" w:color="000000"/>
-              <w:bottom w:val="single" w:sz="4" w:color="000000"/>
-              <w:right w:val="single" w:sz="4" w:color="000000"/>
-            </w:tcBorders>
-            <w:shd w:fill="FFFFFF"/>
-            <w:tcMar>
-              <w:top w:w="85" w:type="dxa"/>
-              <w:left w:w="85" w:type="dxa"/>
-              <w:bottom w:w="85" w:type="dxa"/>
-              <w:right w:w="85" w:type="dxa"/>
-            </w:tcMar>
-          </w:tcPr>
-          <w:p>
-            <w:pPr>
-              <w:spacing w:after="80" w:before="80" w:line="288" w:lineRule="exact"/>
-              <w:ind w:firstLine="0" w:left="0" w:right="0"/>
-              <w:jc w:val="left"/>
-            </w:pPr>
-            <w:r>
-              <w:rPr>
-                <w:rFonts w:ascii="Times New Roman" w:hAnsi="Times New Roman" w:eastAsia="Times New Roman" w:cs="Times New Roman"/>
-                <w:b w:val="0"/>
-                <w:i w:val="0"/>
-                <w:color w:val="000000"/>
-                <w:sz w:val="24"/>
-              </w:rPr>
-              <w:t>data/literature/extraction_log.md</w:t>
-            </w:r>
-          </w:p>
-        </w:tc>
-        <w:tc>
-          <w:tcPr>
-            <w:tcW w:type="dxa" w:w="4778"/>
-            <w:vAlign w:val="center"/>
-            <w:tcBorders>
-              <w:top w:val="single" w:sz="4" w:color="000000"/>
-              <w:left w:val="single" w:sz="4" w:color="000000"/>
-              <w:bottom w:val="single" w:sz="4" w:color="000000"/>
-              <w:right w:val="single" w:sz="4" w:color="000000"/>
-            </w:tcBorders>
-            <w:shd w:fill="FFFFFF"/>
-            <w:tcMar>
-              <w:top w:w="85" w:type="dxa"/>
-              <w:left w:w="85" w:type="dxa"/>
-              <w:bottom w:w="85" w:type="dxa"/>
-              <w:right w:w="85" w:type="dxa"/>
-            </w:tcMar>
-          </w:tcPr>
-          <w:p>
-            <w:pPr>
-              <w:spacing w:after="80" w:before="80" w:line="288" w:lineRule="exact"/>
-              <w:ind w:firstLine="0" w:left="0" w:right="0"/>
-              <w:jc w:val="left"/>
-            </w:pPr>
-            <w:r>
-              <w:rPr>
-                <w:rFonts w:ascii="Times New Roman" w:hAnsi="Times New Roman" w:eastAsia="Times New Roman" w:cs="Times New Roman"/>
-                <w:b w:val="0"/>
-                <w:i w:val="0"/>
-                <w:color w:val="000000"/>
-                <w:sz w:val="24"/>
-              </w:rPr>
-              <w:t>Page and table audit and skipped values</w:t>
-            </w:r>
-          </w:p>
-        </w:tc>
-      </w:tr>
-      <w:tr>
-        <w:trPr>
-          <w:cantSplit/>
-        </w:trPr>
-        <w:tc>
-          <w:tcPr>
-            <w:tcW w:type="dxa" w:w="4247"/>
-            <w:vAlign w:val="center"/>
-            <w:tcBorders>
-              <w:top w:val="single" w:sz="4" w:color="000000"/>
-              <w:left w:val="single" w:sz="4" w:color="000000"/>
-              <w:bottom w:val="single" w:sz="4" w:color="000000"/>
-              <w:right w:val="single" w:sz="4" w:color="000000"/>
-            </w:tcBorders>
-            <w:shd w:fill="FFFFFF"/>
-            <w:tcMar>
-              <w:top w:w="85" w:type="dxa"/>
-              <w:left w:w="85" w:type="dxa"/>
-              <w:bottom w:w="85" w:type="dxa"/>
-              <w:right w:w="85" w:type="dxa"/>
-            </w:tcMar>
-          </w:tcPr>
-          <w:p>
-            <w:pPr>
-              <w:spacing w:after="80" w:before="80" w:line="288" w:lineRule="exact"/>
-              <w:ind w:firstLine="0" w:left="0" w:right="0"/>
-              <w:jc w:val="left"/>
-            </w:pPr>
-            <w:r>
-              <w:rPr>
-                <w:rFonts w:ascii="Times New Roman" w:hAnsi="Times New Roman" w:eastAsia="Times New Roman" w:cs="Times New Roman"/>
-                <w:b w:val="0"/>
-                <w:i w:val="0"/>
-                <w:color w:val="000000"/>
-                <w:sz w:val="24"/>
-              </w:rPr>
-              <w:t>docs/literature_review_matrix.csv</w:t>
-            </w:r>
-          </w:p>
-        </w:tc>
-        <w:tc>
-          <w:tcPr>
-            <w:tcW w:type="dxa" w:w="4778"/>
-            <w:vAlign w:val="center"/>
-            <w:tcBorders>
-              <w:top w:val="single" w:sz="4" w:color="000000"/>
-              <w:left w:val="single" w:sz="4" w:color="000000"/>
-              <w:bottom w:val="single" w:sz="4" w:color="000000"/>
-              <w:right w:val="single" w:sz="4" w:color="000000"/>
-            </w:tcBorders>
-            <w:shd w:fill="FFFFFF"/>
-            <w:tcMar>
-              <w:top w:w="85" w:type="dxa"/>
-              <w:left w:w="85" w:type="dxa"/>
-              <w:bottom w:w="85" w:type="dxa"/>
-              <w:right w:w="85" w:type="dxa"/>
-            </w:tcMar>
-          </w:tcPr>
-          <w:p>
-            <w:pPr>
-              <w:spacing w:after="80" w:before="80" w:line="288" w:lineRule="exact"/>
-              <w:ind w:firstLine="0" w:left="0" w:right="0"/>
-              <w:jc w:val="left"/>
-            </w:pPr>
-            <w:r>
-              <w:rPr>
-                <w:rFonts w:ascii="Times New Roman" w:hAnsi="Times New Roman" w:eastAsia="Times New Roman" w:cs="Times New Roman"/>
-                <w:b w:val="0"/>
-                <w:i w:val="0"/>
-                <w:color w:val="000000"/>
-                <w:sz w:val="24"/>
-              </w:rPr>
-              <w:t>35 source review matrix and screening status</w:t>
-            </w:r>
-          </w:p>
-        </w:tc>
-      </w:tr>
-      <w:tr>
-        <w:trPr>
-          <w:cantSplit/>
-        </w:trPr>
-        <w:tc>
-          <w:tcPr>
-            <w:tcW w:type="dxa" w:w="4247"/>
-            <w:vAlign w:val="center"/>
-            <w:tcBorders>
-              <w:top w:val="single" w:sz="4" w:color="000000"/>
-              <w:left w:val="single" w:sz="4" w:color="000000"/>
-              <w:bottom w:val="single" w:sz="4" w:color="000000"/>
-              <w:right w:val="single" w:sz="4" w:color="000000"/>
-            </w:tcBorders>
-            <w:shd w:fill="FFFFFF"/>
-            <w:tcMar>
-              <w:top w:w="85" w:type="dxa"/>
-              <w:left w:w="85" w:type="dxa"/>
-              <w:bottom w:w="85" w:type="dxa"/>
-              <w:right w:w="85" w:type="dxa"/>
-            </w:tcMar>
-          </w:tcPr>
-          <w:p>
-            <w:pPr>
-              <w:spacing w:after="80" w:before="80" w:line="288" w:lineRule="exact"/>
-              <w:ind w:firstLine="0" w:left="0" w:right="0"/>
-              <w:jc w:val="left"/>
-            </w:pPr>
-            <w:r>
-              <w:rPr>
-                <w:rFonts w:ascii="Times New Roman" w:hAnsi="Times New Roman" w:eastAsia="Times New Roman" w:cs="Times New Roman"/>
-                <w:b w:val="0"/>
-                <w:i w:val="0"/>
-                <w:color w:val="000000"/>
-                <w:sz w:val="24"/>
-              </w:rPr>
-              <w:t>docs/references_ieee.md</w:t>
-            </w:r>
-          </w:p>
-        </w:tc>
-        <w:tc>
-          <w:tcPr>
-            <w:tcW w:type="dxa" w:w="4778"/>
-            <w:vAlign w:val="center"/>
-            <w:tcBorders>
-              <w:top w:val="single" w:sz="4" w:color="000000"/>
-              <w:left w:val="single" w:sz="4" w:color="000000"/>
-              <w:bottom w:val="single" w:sz="4" w:color="000000"/>
-              <w:right w:val="single" w:sz="4" w:color="000000"/>
-            </w:tcBorders>
-            <w:shd w:fill="FFFFFF"/>
-            <w:tcMar>
-              <w:top w:w="85" w:type="dxa"/>
-              <w:left w:w="85" w:type="dxa"/>
-              <w:bottom w:w="85" w:type="dxa"/>
-              <w:right w:w="85" w:type="dxa"/>
-            </w:tcMar>
-          </w:tcPr>
-          <w:p>
-            <w:pPr>
-              <w:spacing w:after="80" w:before="80" w:line="288" w:lineRule="exact"/>
-              <w:ind w:firstLine="0" w:left="0" w:right="0"/>
-              <w:jc w:val="left"/>
-            </w:pPr>
-            <w:r>
-              <w:rPr>
-                <w:rFonts w:ascii="Times New Roman" w:hAnsi="Times New Roman" w:eastAsia="Times New Roman" w:cs="Times New Roman"/>
-                <w:b w:val="0"/>
-                <w:i w:val="0"/>
-                <w:color w:val="000000"/>
-                <w:sz w:val="24"/>
-              </w:rPr>
-              <w:t>Numbered IEEE style references</w:t>
-            </w:r>
-          </w:p>
-        </w:tc>
-      </w:tr>
-      <w:tr>
-        <w:trPr>
-          <w:cantSplit/>
-        </w:trPr>
-        <w:tc>
-          <w:tcPr>
-            <w:tcW w:type="dxa" w:w="4247"/>
-            <w:vAlign w:val="center"/>
-            <w:tcBorders>
-              <w:top w:val="single" w:sz="4" w:color="000000"/>
-              <w:left w:val="single" w:sz="4" w:color="000000"/>
-              <w:bottom w:val="single" w:sz="4" w:color="000000"/>
-              <w:right w:val="single" w:sz="4" w:color="000000"/>
-            </w:tcBorders>
-            <w:shd w:fill="FFFFFF"/>
-            <w:tcMar>
-              <w:top w:w="85" w:type="dxa"/>
-              <w:left w:w="85" w:type="dxa"/>
-              <w:bottom w:w="85" w:type="dxa"/>
-              <w:right w:w="85" w:type="dxa"/>
-            </w:tcMar>
-          </w:tcPr>
-          <w:p>
-            <w:pPr>
-              <w:spacing w:after="80" w:before="80" w:line="288" w:lineRule="exact"/>
-              <w:ind w:firstLine="0" w:left="0" w:right="0"/>
-              <w:jc w:val="left"/>
-            </w:pPr>
-            <w:r>
-              <w:rPr>
-                <w:rFonts w:ascii="Times New Roman" w:hAnsi="Times New Roman" w:eastAsia="Times New Roman" w:cs="Times New Roman"/>
-                <w:b w:val="0"/>
-                <w:i w:val="0"/>
-                <w:color w:val="000000"/>
-                <w:sz w:val="24"/>
-              </w:rPr>
-              <w:t>docs/verification.md</w:t>
-            </w:r>
-          </w:p>
-        </w:tc>
-        <w:tc>
-          <w:tcPr>
-            <w:tcW w:type="dxa" w:w="4778"/>
-            <w:vAlign w:val="center"/>
-            <w:tcBorders>
-              <w:top w:val="single" w:sz="4" w:color="000000"/>
-              <w:left w:val="single" w:sz="4" w:color="000000"/>
-              <w:bottom w:val="single" w:sz="4" w:color="000000"/>
-              <w:right w:val="single" w:sz="4" w:color="000000"/>
-            </w:tcBorders>
-            <w:shd w:fill="FFFFFF"/>
-            <w:tcMar>
-              <w:top w:w="85" w:type="dxa"/>
-              <w:left w:w="85" w:type="dxa"/>
-              <w:bottom w:w="85" w:type="dxa"/>
-              <w:right w:w="85" w:type="dxa"/>
-            </w:tcMar>
-          </w:tcPr>
-          <w:p>
-            <w:pPr>
-              <w:spacing w:after="80" w:before="80" w:line="288" w:lineRule="exact"/>
-              <w:ind w:firstLine="0" w:left="0" w:right="0"/>
-              <w:jc w:val="left"/>
-            </w:pPr>
-            <w:r>
-              <w:rPr>
-                <w:rFonts w:ascii="Times New Roman" w:hAnsi="Times New Roman" w:eastAsia="Times New Roman" w:cs="Times New Roman"/>
-                <w:b w:val="0"/>
-                <w:i w:val="0"/>
-                <w:color w:val="000000"/>
-                <w:sz w:val="24"/>
-              </w:rPr>
-              <w:t>Actual build environment and software checks</w:t>
-            </w:r>
-          </w:p>
-        </w:tc>
-      </w:tr>
-    </w:tbl>
-    <w:p>
-      <w:pPr>
-        <w:spacing w:line="433" w:lineRule="exact" w:after="160" w:before="0"/>
-        <w:ind w:firstLine="0" w:left="0" w:right="0"/>
-        <w:jc w:val="both"/>
-      </w:pPr>
-      <w:r>
-        <w:rPr>
-          <w:rFonts w:ascii="Times New Roman" w:hAnsi="Times New Roman" w:eastAsia="Times New Roman" w:cs="Times New Roman"/>
-          <w:b w:val="0"/>
-          <w:i w:val="0"/>
-          <w:color w:val="000000"/>
-          <w:sz w:val="24"/>
-        </w:rPr>
-        <w:t>Unknown literature inputs remain blank. Material parameter changes require regeneration and retraining. START_DEMO.bat launches the separate direct simulator and saved ML demonstration.</w:t>
-      </w:r>
-    </w:p>
-    <w:p>
-      <w:pPr>
-        <w:spacing w:before="0" w:after="0" w:line="1" w:lineRule="exact"/>
-        <w:sectPr>
-          <w:footerReference w:type="default" r:id="rId11"/>
-          <w:footerReference w:type="first" r:id="rId16"/>
-          <w:pgSz w:w="11906" w:h="16838"/>
-          <w:pgMar w:top="1440" w:right="1440" w:bottom="1440" w:left="1440" w:header="720" w:footer="720" w:gutter="0"/>
-          <w:cols w:space="720"/>
-          <w:titlePg/>
-          <w:docGrid w:linePitch="360"/>
-          <w:pgNumType w:fmt="decimal"/>
-        </w:sectPr>
-      </w:pPr>
-    </w:p>
-    <w:p>
-      <w:pPr>
-        <w:pStyle w:val="FrontHeading"/>
-        <w:pageBreakBefore w:val="0"/>
-        <w:spacing w:before="1040" w:after="440" w:line="420" w:lineRule="exact"/>
-        <w:ind w:firstLine="0" w:left="0" w:right="0"/>
-        <w:jc w:val="center"/>
-      </w:pPr>
-      <w:r>
-        <w:rPr>
-          <w:rFonts w:ascii="Times New Roman" w:hAnsi="Times New Roman" w:eastAsia="Times New Roman" w:cs="Times New Roman"/>
-          <w:b/>
-          <w:i w:val="0"/>
-          <w:color w:val="000000"/>
-          <w:sz w:val="34"/>
-        </w:rPr>
         <w:t>REFERENCES</w:t>
       </w:r>
     </w:p>

</xml_diff>